<commit_message>
fix(core): merge repeated properties, flatten nested markup, and drop unpreserved boundary spaces
Repeated paragraph properties before the text now merge, a later element
adding to the earlier one attribute by attribute, with tab stops from both;
run properties merge the same way. A paragraph or run written inside another
joins it, and a table written inside a paragraph stays a table after it.
Text in w:t and w:delText drops its leading and trailing spaces, and shows a
tab as a space, unless xml:space="preserve" is on the element or the part
root. Fixtures and test XML that meant to keep their spaces now say so.

Co-Authored-By: Claude Opus 5.5 <noreply@anthropic.com>
</commit_message>
<xml_diff>
--- a/e2e/fixtures/complex-styles.docx
+++ b/e2e/fixtures/complex-styles.docx
@@ -25,7 +25,7 @@
     </w:p>
     <w:p>
       <w:r>
-        <w:t>Another paragraph with </w:t>
+        <w:t xml:space="preserve">Another paragraph with </w:t>
       </w:r>
       <w:r>
         <w:rPr>
@@ -34,7 +34,7 @@
         <w:t>Times New Roman font</w:t>
       </w:r>
       <w:r>
-        <w:t> and </w:t>
+        <w:t xml:space="preserve"> and </w:t>
       </w:r>
       <w:r>
         <w:rPr>
@@ -51,13 +51,13 @@
         <w:rPr>
           <w:color w:val="FF0000"/>
         </w:rPr>
-        <w:t>Red text. </w:t>
+        <w:t xml:space="preserve">Red text. </w:t>
       </w:r>
       <w:r>
         <w:rPr>
           <w:color w:val="0000FF"/>
         </w:rPr>
-        <w:t>Blue text. </w:t>
+        <w:t xml:space="preserve">Blue text. </w:t>
       </w:r>
       <w:r>
         <w:rPr>
@@ -74,7 +74,7 @@
         <w:t>Highlighted text</w:t>
       </w:r>
       <w:r>
-        <w:t> and normal text.</w:t>
+        <w:t xml:space="preserve"> and normal text.</w:t>
       </w:r>
     </w:p>
     <w:sectPr>

</xml_diff>